<commit_message>
Build: add LLVM/Clang toolchain binaries and headers
Add LLVM/Clang 21.1.1 toolchain executables, libraries, and include files for Windows x86_64 platform. Includes compiler binaries (clang.exe, clang++.exe), debugger (lldb.exe), static analyzers (scan-build), and development headers. This provides the complete toolchain needed for C/C++ development and analysis.

The changes include:
- Windows executables for LLVM, Clang, and related tools
- Header files for compiler and debugger integration
- Support scripts for build analysis and interception
- Documentation and license files
</commit_message>
<xml_diff>
--- a/Other Files/Prompt - Gemini Code Assist Agent - Codebase Audit, Refactor, and Reorganisation.docx
+++ b/Other Files/Prompt - Gemini Code Assist Agent - Codebase Audit, Refactor, and Reorganisation.docx
@@ -79,7 +79,10 @@
         <w:t>s</w:t>
       </w:r>
       <w:r>
-        <w:t>e the file structure to align with our project's modular architecture.</w:t>
+        <w:t>e the file structure to align with our project's modular architecture</w:t>
+      </w:r>
+      <w:r>
+        <w:t>.</w:t>
       </w:r>
     </w:p>
     <w:p>
@@ -478,32 +481,7 @@
           <w:b/>
           <w:bCs/>
         </w:rPr>
-        <w:t>/</w:t>
-      </w:r>
-      <w:proofErr w:type="spellStart"/>
-      <w:proofErr w:type="gramStart"/>
-      <w:r>
-        <w:rPr>
-          <w:b/>
-          <w:bCs/>
-        </w:rPr>
-        <w:t>nautilus</w:t>
-      </w:r>
-      <w:proofErr w:type="gramEnd"/>
-      <w:r>
-        <w:rPr>
-          <w:b/>
-          <w:bCs/>
-        </w:rPr>
-        <w:t>_trader_engine</w:t>
-      </w:r>
-      <w:proofErr w:type="spellEnd"/>
-      <w:r>
-        <w:rPr>
-          <w:b/>
-          <w:bCs/>
-        </w:rPr>
-        <w:t>:</w:t>
+        <w:t>/nautilus_trader_engine:</w:t>
       </w:r>
     </w:p>
     <w:p>
@@ -515,15 +493,7 @@
         <w:spacing w:line="240" w:lineRule="auto"/>
       </w:pPr>
       <w:r>
-        <w:t>/</w:t>
-      </w:r>
-      <w:proofErr w:type="gramStart"/>
-      <w:r>
-        <w:t>strategies</w:t>
-      </w:r>
-      <w:proofErr w:type="gramEnd"/>
-      <w:r>
-        <w:t>: For all trading strategy implementations.</w:t>
+        <w:t>/strategies: For all trading strategy implementations.</w:t>
       </w:r>
     </w:p>
     <w:p>
@@ -535,15 +505,7 @@
         <w:spacing w:line="240" w:lineRule="auto"/>
       </w:pPr>
       <w:r>
-        <w:t>/</w:t>
-      </w:r>
-      <w:proofErr w:type="gramStart"/>
-      <w:r>
-        <w:t>indicators</w:t>
-      </w:r>
-      <w:proofErr w:type="gramEnd"/>
-      <w:r>
-        <w:t>: For all custom technical indicator implementations.</w:t>
+        <w:t>/indicators: For all custom technical indicator implementations.</w:t>
       </w:r>
     </w:p>
     <w:p>
@@ -555,23 +517,7 @@
         <w:spacing w:line="240" w:lineRule="auto"/>
       </w:pPr>
       <w:r>
-        <w:t>/</w:t>
-      </w:r>
-      <w:proofErr w:type="gramStart"/>
-      <w:r>
-        <w:t>core</w:t>
-      </w:r>
-      <w:proofErr w:type="gramEnd"/>
-      <w:r>
-        <w:t xml:space="preserve">: For the core logic integrating with the </w:t>
-      </w:r>
-      <w:proofErr w:type="spellStart"/>
-      <w:r>
-        <w:t>NautilusTrader</w:t>
-      </w:r>
-      <w:proofErr w:type="spellEnd"/>
-      <w:r>
-        <w:t xml:space="preserve"> library.</w:t>
+        <w:t>/core: For the core logic integrating with the NautilusTrader library.</w:t>
       </w:r>
     </w:p>
     <w:p>
@@ -583,15 +529,7 @@
         <w:spacing w:line="240" w:lineRule="auto"/>
       </w:pPr>
       <w:r>
-        <w:t>/</w:t>
-      </w:r>
-      <w:proofErr w:type="gramStart"/>
-      <w:r>
-        <w:t>tests</w:t>
-      </w:r>
-      <w:proofErr w:type="gramEnd"/>
-      <w:r>
-        <w:t>: For all unit and integration tests related to the engine.</w:t>
+        <w:t>/tests: For all unit and integration tests related to the engine.</w:t>
       </w:r>
     </w:p>
     <w:p>
@@ -607,32 +545,7 @@
           <w:b/>
           <w:bCs/>
         </w:rPr>
-        <w:t>/</w:t>
-      </w:r>
-      <w:proofErr w:type="spellStart"/>
-      <w:proofErr w:type="gramStart"/>
-      <w:r>
-        <w:rPr>
-          <w:b/>
-          <w:bCs/>
-        </w:rPr>
-        <w:t>ai</w:t>
-      </w:r>
-      <w:proofErr w:type="gramEnd"/>
-      <w:r>
-        <w:rPr>
-          <w:b/>
-          <w:bCs/>
-        </w:rPr>
-        <w:t>_assistant</w:t>
-      </w:r>
-      <w:proofErr w:type="spellEnd"/>
-      <w:r>
-        <w:rPr>
-          <w:b/>
-          <w:bCs/>
-        </w:rPr>
-        <w:t>:</w:t>
+        <w:t>/ai_assistant:</w:t>
       </w:r>
     </w:p>
     <w:p>
@@ -644,15 +557,7 @@
         <w:spacing w:line="240" w:lineRule="auto"/>
       </w:pPr>
       <w:r>
-        <w:t>/</w:t>
-      </w:r>
-      <w:proofErr w:type="gramStart"/>
-      <w:r>
-        <w:t>agents</w:t>
-      </w:r>
-      <w:proofErr w:type="gramEnd"/>
-      <w:r>
-        <w:t>: For the specific logic of each speciali</w:t>
+        <w:t>/agents: For the specific logic of each speciali</w:t>
       </w:r>
       <w:r>
         <w:t>s</w:t>
@@ -670,23 +575,7 @@
         <w:spacing w:line="240" w:lineRule="auto"/>
       </w:pPr>
       <w:r>
-        <w:t>/</w:t>
-      </w:r>
-      <w:proofErr w:type="gramStart"/>
-      <w:r>
-        <w:t>workflows</w:t>
-      </w:r>
-      <w:proofErr w:type="gramEnd"/>
-      <w:r>
-        <w:t xml:space="preserve">: For </w:t>
-      </w:r>
-      <w:proofErr w:type="spellStart"/>
-      <w:r>
-        <w:t>LangGraph</w:t>
-      </w:r>
-      <w:proofErr w:type="spellEnd"/>
-      <w:r>
-        <w:t xml:space="preserve"> workflow definitions.</w:t>
+        <w:t>/workflows: For LangGraph workflow definitions.</w:t>
       </w:r>
     </w:p>
     <w:p>
@@ -698,15 +587,7 @@
         <w:spacing w:line="240" w:lineRule="auto"/>
       </w:pPr>
       <w:r>
-        <w:t>/</w:t>
-      </w:r>
-      <w:proofErr w:type="gramStart"/>
-      <w:r>
-        <w:t>models</w:t>
-      </w:r>
-      <w:proofErr w:type="gramEnd"/>
-      <w:r>
-        <w:t>: For any seriali</w:t>
+        <w:t>/models: For any seriali</w:t>
       </w:r>
       <w:r>
         <w:t>s</w:t>
@@ -724,15 +605,7 @@
         <w:spacing w:line="240" w:lineRule="auto"/>
       </w:pPr>
       <w:r>
-        <w:t>/</w:t>
-      </w:r>
-      <w:proofErr w:type="gramStart"/>
-      <w:r>
-        <w:t>tools</w:t>
-      </w:r>
-      <w:proofErr w:type="gramEnd"/>
-      <w:r>
-        <w:t>: For custom tools that the AI agents can use.</w:t>
+        <w:t>/tools: For custom tools that the AI agents can use.</w:t>
       </w:r>
     </w:p>
     <w:p>
@@ -748,23 +621,7 @@
           <w:b/>
           <w:bCs/>
         </w:rPr>
-        <w:t>/</w:t>
-      </w:r>
-      <w:proofErr w:type="gramStart"/>
-      <w:r>
-        <w:rPr>
-          <w:b/>
-          <w:bCs/>
-        </w:rPr>
-        <w:t>infrastructure</w:t>
-      </w:r>
-      <w:proofErr w:type="gramEnd"/>
-      <w:r>
-        <w:rPr>
-          <w:b/>
-          <w:bCs/>
-        </w:rPr>
-        <w:t>:</w:t>
+        <w:t>/infrastructure:</w:t>
       </w:r>
     </w:p>
     <w:p>
@@ -776,15 +633,7 @@
         <w:spacing w:line="240" w:lineRule="auto"/>
       </w:pPr>
       <w:r>
-        <w:t>/</w:t>
-      </w:r>
-      <w:proofErr w:type="gramStart"/>
-      <w:r>
-        <w:t>terraform</w:t>
-      </w:r>
-      <w:proofErr w:type="gramEnd"/>
-      <w:r>
-        <w:t>: For all Terraform Infrastructure-as-Code files.</w:t>
+        <w:t>/terraform: For all Terraform Infrastructure-as-Code files.</w:t>
       </w:r>
     </w:p>
     <w:p>
@@ -797,17 +646,7 @@
       </w:pPr>
       <w:r>
         <w:lastRenderedPageBreak/>
-        <w:t>/</w:t>
-      </w:r>
-      <w:proofErr w:type="spellStart"/>
-      <w:proofErr w:type="gramStart"/>
-      <w:r>
-        <w:t>kubernetes</w:t>
-      </w:r>
-      <w:proofErr w:type="spellEnd"/>
-      <w:proofErr w:type="gramEnd"/>
-      <w:r>
-        <w:t>: For all Kubernetes manifests and Helm charts.</w:t>
+        <w:t>/kubernetes: For all Kubernetes manifests and Helm charts.</w:t>
       </w:r>
     </w:p>
     <w:p>
@@ -819,23 +658,7 @@
         <w:spacing w:line="240" w:lineRule="auto"/>
       </w:pPr>
       <w:r>
-        <w:t>/</w:t>
-      </w:r>
-      <w:proofErr w:type="gramStart"/>
-      <w:r>
-        <w:t>docker</w:t>
-      </w:r>
-      <w:proofErr w:type="gramEnd"/>
-      <w:r>
-        <w:t xml:space="preserve">: For all base </w:t>
-      </w:r>
-      <w:proofErr w:type="spellStart"/>
-      <w:r>
-        <w:t>Dockerfiles</w:t>
-      </w:r>
-      <w:proofErr w:type="spellEnd"/>
-      <w:r>
-        <w:t xml:space="preserve"> and Docker Compose files for local development.</w:t>
+        <w:t>/docker: For all base Dockerfiles and Docker Compose files for local development.</w:t>
       </w:r>
     </w:p>
     <w:p>
@@ -847,28 +670,7 @@
         <w:spacing w:line="240" w:lineRule="auto"/>
       </w:pPr>
       <w:r>
-        <w:t>/</w:t>
-      </w:r>
-      <w:proofErr w:type="spellStart"/>
-      <w:proofErr w:type="gramStart"/>
-      <w:r>
-        <w:t>ci</w:t>
-      </w:r>
-      <w:proofErr w:type="gramEnd"/>
-      <w:r>
-        <w:t>_cd</w:t>
-      </w:r>
-      <w:proofErr w:type="spellEnd"/>
-      <w:r>
-        <w:t>: For all GitHub Actions workflow (.</w:t>
-      </w:r>
-      <w:proofErr w:type="spellStart"/>
-      <w:r>
-        <w:t>yml</w:t>
-      </w:r>
-      <w:proofErr w:type="spellEnd"/>
-      <w:r>
-        <w:t>) files.</w:t>
+        <w:t>/ci_cd: For all GitHub Actions workflow (.yml) files.</w:t>
       </w:r>
     </w:p>
     <w:p>
@@ -884,23 +686,7 @@
           <w:b/>
           <w:bCs/>
         </w:rPr>
-        <w:t>/</w:t>
-      </w:r>
-      <w:proofErr w:type="gramStart"/>
-      <w:r>
-        <w:rPr>
-          <w:b/>
-          <w:bCs/>
-        </w:rPr>
-        <w:t>frontend</w:t>
-      </w:r>
-      <w:proofErr w:type="gramEnd"/>
-      <w:r>
-        <w:rPr>
-          <w:b/>
-          <w:bCs/>
-        </w:rPr>
-        <w:t>:</w:t>
+        <w:t>/frontend:</w:t>
       </w:r>
     </w:p>
     <w:p>
@@ -912,15 +698,7 @@
         <w:spacing w:line="240" w:lineRule="auto"/>
       </w:pPr>
       <w:r>
-        <w:t>/</w:t>
-      </w:r>
-      <w:proofErr w:type="spellStart"/>
-      <w:r>
-        <w:t>src</w:t>
-      </w:r>
-      <w:proofErr w:type="spellEnd"/>
-      <w:r>
-        <w:t>/components: For all React components, organi</w:t>
+        <w:t>/src/components: For all React components, organi</w:t>
       </w:r>
       <w:r>
         <w:t>s</w:t>
@@ -938,15 +716,7 @@
         <w:spacing w:line="240" w:lineRule="auto"/>
       </w:pPr>
       <w:r>
-        <w:t>/</w:t>
-      </w:r>
-      <w:proofErr w:type="spellStart"/>
-      <w:r>
-        <w:t>src</w:t>
-      </w:r>
-      <w:proofErr w:type="spellEnd"/>
-      <w:r>
-        <w:t>/app: For Next.js App Router pages and layouts.</w:t>
+        <w:t>/src/app: For Next.js App Router pages and layouts.</w:t>
       </w:r>
     </w:p>
     <w:p>
@@ -958,15 +728,7 @@
         <w:spacing w:line="240" w:lineRule="auto"/>
       </w:pPr>
       <w:r>
-        <w:t>/</w:t>
-      </w:r>
-      <w:proofErr w:type="spellStart"/>
-      <w:r>
-        <w:t>src</w:t>
-      </w:r>
-      <w:proofErr w:type="spellEnd"/>
-      <w:r>
-        <w:t>/store: For all Redux Toolkit state management logic.</w:t>
+        <w:t>/src/store: For all Redux Toolkit state management logic.</w:t>
       </w:r>
     </w:p>
     <w:p>
@@ -978,15 +740,7 @@
         <w:spacing w:line="240" w:lineRule="auto"/>
       </w:pPr>
       <w:r>
-        <w:t>/</w:t>
-      </w:r>
-      <w:proofErr w:type="spellStart"/>
-      <w:r>
-        <w:t>src</w:t>
-      </w:r>
-      <w:proofErr w:type="spellEnd"/>
-      <w:r>
-        <w:t>/hooks: For custom React hooks.</w:t>
+        <w:t>/src/hooks: For custom React hooks.</w:t>
       </w:r>
     </w:p>
     <w:p>
@@ -1002,23 +756,7 @@
           <w:b/>
           <w:bCs/>
         </w:rPr>
-        <w:t>/</w:t>
-      </w:r>
-      <w:proofErr w:type="gramStart"/>
-      <w:r>
-        <w:rPr>
-          <w:b/>
-          <w:bCs/>
-        </w:rPr>
-        <w:t>services</w:t>
-      </w:r>
-      <w:proofErr w:type="gramEnd"/>
-      <w:r>
-        <w:rPr>
-          <w:b/>
-          <w:bCs/>
-        </w:rPr>
-        <w:t>:</w:t>
+        <w:t>/services:</w:t>
       </w:r>
     </w:p>
     <w:p>
@@ -1054,18 +792,8 @@
         <w:spacing w:line="240" w:lineRule="auto"/>
       </w:pPr>
       <w:r>
-        <w:t>/</w:t>
-      </w:r>
-      <w:proofErr w:type="spellStart"/>
-      <w:proofErr w:type="gramStart"/>
-      <w:r>
-        <w:t>market</w:t>
-      </w:r>
-      <w:proofErr w:type="gramEnd"/>
-      <w:r>
-        <w:t>_data_service</w:t>
-      </w:r>
-      <w:proofErr w:type="spellEnd"/>
+        <w:t>/market_data_service</w:t>
+      </w:r>
     </w:p>
     <w:p>
       <w:pPr>
@@ -1076,18 +804,8 @@
         <w:spacing w:line="240" w:lineRule="auto"/>
       </w:pPr>
       <w:r>
-        <w:t>/</w:t>
-      </w:r>
-      <w:proofErr w:type="spellStart"/>
-      <w:proofErr w:type="gramStart"/>
-      <w:r>
-        <w:t>order</w:t>
-      </w:r>
-      <w:proofErr w:type="gramEnd"/>
-      <w:r>
-        <w:t>_management_service</w:t>
-      </w:r>
-      <w:proofErr w:type="spellEnd"/>
+        <w:t>/order_management_service</w:t>
+      </w:r>
     </w:p>
     <w:p>
       <w:pPr>
@@ -1098,18 +816,8 @@
         <w:spacing w:line="240" w:lineRule="auto"/>
       </w:pPr>
       <w:r>
-        <w:t>/</w:t>
-      </w:r>
-      <w:proofErr w:type="spellStart"/>
-      <w:proofErr w:type="gramStart"/>
-      <w:r>
-        <w:t>risk</w:t>
-      </w:r>
-      <w:proofErr w:type="gramEnd"/>
-      <w:r>
-        <w:t>_manager_service</w:t>
-      </w:r>
-      <w:proofErr w:type="spellEnd"/>
+        <w:t>/risk_manager_service</w:t>
+      </w:r>
     </w:p>
     <w:p>
       <w:pPr>
@@ -1120,18 +828,8 @@
         <w:spacing w:line="240" w:lineRule="auto"/>
       </w:pPr>
       <w:r>
-        <w:t>/</w:t>
-      </w:r>
-      <w:proofErr w:type="spellStart"/>
-      <w:proofErr w:type="gramStart"/>
-      <w:r>
-        <w:t>portfolio</w:t>
-      </w:r>
-      <w:proofErr w:type="gramEnd"/>
-      <w:r>
-        <w:t>_manager_service</w:t>
-      </w:r>
-      <w:proofErr w:type="spellEnd"/>
+        <w:t>/portfolio_manager_service</w:t>
+      </w:r>
     </w:p>
     <w:p>
       <w:pPr>
@@ -2612,6 +2310,7 @@
   <w:style w:type="character" w:default="1" w:styleId="DefaultParagraphFont">
     <w:name w:val="Default Paragraph Font"/>
     <w:uiPriority w:val="1"/>
+    <w:semiHidden/>
     <w:unhideWhenUsed/>
   </w:style>
   <w:style w:type="table" w:default="1" w:styleId="TableNormal">

</xml_diff>